<commit_message>
added register.php resend_mailer.php. Also deleted several files from the docs directory that are not needed anymore.
</commit_message>
<xml_diff>
--- a/docs/FINAL YEAR REPORT.docx
+++ b/docs/FINAL YEAR REPORT.docx
@@ -522,10 +522,7 @@
         <w:spacing w:line="360" w:lineRule="auto"/>
       </w:pPr>
       <w:r>
-        <w:t>The study concluded that the developed online voting system provides a practical and scalable solution for improving the management of Guild elections at Kyambogo University and can serve as a model for electronic voting systems in other higher institutions of learning</w:t>
-      </w:r>
-      <w:r>
-        <w:t>.</w:t>
+        <w:t>The study concluded that the developed online voting system provides a practical and scalable solution for improving the management of Guild elections at Kyambogo University and can serve as a model for electronic voting systems in other higher institutions of learning.</w:t>
       </w:r>
     </w:p>
     <w:p>
@@ -2596,7 +2593,7 @@
     <w:sdt>
       <w:sdtPr>
         <w:rPr>
-          <w:rFonts w:eastAsiaTheme="minorHAnsi" w:cs="Times New Roman"/>
+          <w:rFonts w:asciiTheme="minorHAnsi" w:eastAsiaTheme="minorHAnsi" w:hAnsiTheme="minorHAnsi" w:cs="Times New Roman"/>
           <w:b w:val="0"/>
           <w:bCs w:val="0"/>
           <w:color w:val="auto"/>
@@ -18202,7 +18199,19 @@
         <w:rPr>
           <w:rFonts w:ascii="Times New Roman" w:hAnsi="Times New Roman" w:cs="Times New Roman"/>
         </w:rPr>
-        <w:t>outweighed the strengths. The growing student population (over 25,000) rendered the manual system unsustainable. A modern online voting system could preserve a digital audit trail (via logs and encrypted records) while eliminating the logistical nightmares and security loopholes of the physical process.</w:t>
+        <w:t xml:space="preserve">outweighed the strengths. The growing student population (over </w:t>
+      </w:r>
+      <w:r>
+        <w:rPr>
+          <w:rFonts w:ascii="Times New Roman" w:hAnsi="Times New Roman" w:cs="Times New Roman"/>
+        </w:rPr>
+        <w:t>33,</w:t>
+      </w:r>
+      <w:r>
+        <w:rPr>
+          <w:rFonts w:ascii="Times New Roman" w:hAnsi="Times New Roman" w:cs="Times New Roman"/>
+        </w:rPr>
+        <w:t>000) rendered the manual system unsustainable. A modern online voting system could preserve a digital audit trail (via logs and encrypted records) while eliminating the logistical nightmares and security loopholes of the physical process.</w:t>
       </w:r>
     </w:p>
     <w:p>
@@ -18273,7 +18282,162 @@
         <w:rPr>
           <w:rFonts w:ascii="Times New Roman" w:hAnsi="Times New Roman" w:cs="Times New Roman"/>
         </w:rPr>
-        <w:t>: Simple registration linked to their existing student number; secure login; view candidate profiles; cast a single, secret vote; receive a confirmation of successful voting.</w:t>
+        <w:t xml:space="preserve"> </w:t>
+      </w:r>
+    </w:p>
+    <w:p>
+      <w:pPr>
+        <w:pStyle w:val="ListParagraph"/>
+        <w:numPr>
+          <w:ilvl w:val="0"/>
+          <w:numId w:val="33"/>
+        </w:numPr>
+        <w:spacing w:line="360" w:lineRule="auto"/>
+        <w:rPr>
+          <w:rFonts w:ascii="Times New Roman" w:hAnsi="Times New Roman" w:cs="Times New Roman"/>
+        </w:rPr>
+      </w:pPr>
+      <w:r>
+        <w:rPr>
+          <w:rFonts w:ascii="Times New Roman" w:hAnsi="Times New Roman" w:cs="Times New Roman"/>
+        </w:rPr>
+        <w:t>Simple registration linked to their existing student number</w:t>
+      </w:r>
+      <w:r>
+        <w:rPr>
+          <w:rFonts w:ascii="Times New Roman" w:hAnsi="Times New Roman" w:cs="Times New Roman"/>
+        </w:rPr>
+        <w:t xml:space="preserve"> and passwords.</w:t>
+      </w:r>
+    </w:p>
+    <w:p>
+      <w:pPr>
+        <w:pStyle w:val="ListParagraph"/>
+        <w:numPr>
+          <w:ilvl w:val="0"/>
+          <w:numId w:val="33"/>
+        </w:numPr>
+        <w:spacing w:line="360" w:lineRule="auto"/>
+        <w:rPr>
+          <w:rFonts w:ascii="Times New Roman" w:hAnsi="Times New Roman" w:cs="Times New Roman"/>
+        </w:rPr>
+      </w:pPr>
+      <w:r>
+        <w:rPr>
+          <w:rFonts w:ascii="Times New Roman" w:hAnsi="Times New Roman" w:cs="Times New Roman"/>
+        </w:rPr>
+        <w:t>S</w:t>
+      </w:r>
+      <w:r>
+        <w:rPr>
+          <w:rFonts w:ascii="Times New Roman" w:hAnsi="Times New Roman" w:cs="Times New Roman"/>
+        </w:rPr>
+        <w:t xml:space="preserve">ecure login </w:t>
+      </w:r>
+      <w:r>
+        <w:rPr>
+          <w:rFonts w:ascii="Times New Roman" w:hAnsi="Times New Roman" w:cs="Times New Roman"/>
+        </w:rPr>
+        <w:t>and log out.</w:t>
+      </w:r>
+    </w:p>
+    <w:p>
+      <w:pPr>
+        <w:pStyle w:val="ListParagraph"/>
+        <w:numPr>
+          <w:ilvl w:val="0"/>
+          <w:numId w:val="33"/>
+        </w:numPr>
+        <w:spacing w:line="360" w:lineRule="auto"/>
+        <w:rPr>
+          <w:rFonts w:ascii="Times New Roman" w:hAnsi="Times New Roman" w:cs="Times New Roman"/>
+        </w:rPr>
+      </w:pPr>
+      <w:r>
+        <w:rPr>
+          <w:rFonts w:ascii="Times New Roman" w:hAnsi="Times New Roman" w:cs="Times New Roman"/>
+        </w:rPr>
+        <w:t>V</w:t>
+      </w:r>
+      <w:r>
+        <w:rPr>
+          <w:rFonts w:ascii="Times New Roman" w:hAnsi="Times New Roman" w:cs="Times New Roman"/>
+        </w:rPr>
+        <w:t>iew candidate profiles</w:t>
+      </w:r>
+      <w:r>
+        <w:rPr>
+          <w:rFonts w:ascii="Times New Roman" w:hAnsi="Times New Roman" w:cs="Times New Roman"/>
+        </w:rPr>
+        <w:t xml:space="preserve"> and manifestos.</w:t>
+      </w:r>
+    </w:p>
+    <w:p>
+      <w:pPr>
+        <w:pStyle w:val="ListParagraph"/>
+        <w:numPr>
+          <w:ilvl w:val="0"/>
+          <w:numId w:val="33"/>
+        </w:numPr>
+        <w:spacing w:line="360" w:lineRule="auto"/>
+        <w:rPr>
+          <w:rFonts w:ascii="Times New Roman" w:hAnsi="Times New Roman" w:cs="Times New Roman"/>
+        </w:rPr>
+      </w:pPr>
+      <w:r>
+        <w:rPr>
+          <w:rFonts w:ascii="Times New Roman" w:hAnsi="Times New Roman" w:cs="Times New Roman"/>
+        </w:rPr>
+        <w:t>C</w:t>
+      </w:r>
+      <w:r>
+        <w:rPr>
+          <w:rFonts w:ascii="Times New Roman" w:hAnsi="Times New Roman" w:cs="Times New Roman"/>
+        </w:rPr>
+        <w:t>ast a single</w:t>
+      </w:r>
+      <w:r>
+        <w:rPr>
+          <w:rFonts w:ascii="Times New Roman" w:hAnsi="Times New Roman" w:cs="Times New Roman"/>
+        </w:rPr>
+        <w:t xml:space="preserve"> and</w:t>
+      </w:r>
+      <w:r>
+        <w:rPr>
+          <w:rFonts w:ascii="Times New Roman" w:hAnsi="Times New Roman" w:cs="Times New Roman"/>
+        </w:rPr>
+        <w:t xml:space="preserve"> secret vote</w:t>
+      </w:r>
+      <w:r>
+        <w:rPr>
+          <w:rFonts w:ascii="Times New Roman" w:hAnsi="Times New Roman" w:cs="Times New Roman"/>
+        </w:rPr>
+        <w:t>.</w:t>
+      </w:r>
+    </w:p>
+    <w:p>
+      <w:pPr>
+        <w:pStyle w:val="ListParagraph"/>
+        <w:numPr>
+          <w:ilvl w:val="0"/>
+          <w:numId w:val="33"/>
+        </w:numPr>
+        <w:spacing w:line="360" w:lineRule="auto"/>
+        <w:rPr>
+          <w:rFonts w:ascii="Times New Roman" w:hAnsi="Times New Roman" w:cs="Times New Roman"/>
+        </w:rPr>
+      </w:pPr>
+      <w:r>
+        <w:rPr>
+          <w:rFonts w:ascii="Times New Roman" w:hAnsi="Times New Roman" w:cs="Times New Roman"/>
+        </w:rPr>
+        <w:t>R</w:t>
+      </w:r>
+      <w:r>
+        <w:rPr>
+          <w:rFonts w:ascii="Times New Roman" w:hAnsi="Times New Roman" w:cs="Times New Roman"/>
+        </w:rPr>
+        <w:t>eceive a confirmation of successful voting.</w:t>
       </w:r>
     </w:p>
     <w:p>
@@ -18293,20 +18457,121 @@
           <w:b/>
           <w:bCs/>
         </w:rPr>
+        <w:lastRenderedPageBreak/>
         <w:t>Electoral Commission</w:t>
       </w:r>
       <w:r>
         <w:rPr>
           <w:rFonts w:ascii="Times New Roman" w:hAnsi="Times New Roman" w:cs="Times New Roman"/>
         </w:rPr>
-        <w:t>: Real</w:t>
+        <w:t xml:space="preserve">: </w:t>
+      </w:r>
+    </w:p>
+    <w:p>
+      <w:pPr>
+        <w:pStyle w:val="ListParagraph"/>
+        <w:numPr>
+          <w:ilvl w:val="1"/>
+          <w:numId w:val="34"/>
+        </w:numPr>
+        <w:spacing w:line="360" w:lineRule="auto"/>
+        <w:rPr>
+          <w:rFonts w:ascii="Times New Roman" w:hAnsi="Times New Roman" w:cs="Times New Roman"/>
+        </w:rPr>
+      </w:pPr>
+      <w:r>
+        <w:rPr>
+          <w:rFonts w:ascii="Times New Roman" w:hAnsi="Times New Roman" w:cs="Times New Roman"/>
+        </w:rPr>
+        <w:t>Real</w:t>
       </w:r>
       <w:r>
         <w:rPr>
           <w:rFonts w:ascii="Times New Roman" w:hAnsi="Times New Roman" w:cs="Times New Roman"/>
         </w:rPr>
         <w:noBreakHyphen/>
-        <w:t>time dashboard showing voter turnout per faculty, total votes cast vs. registered voters, and aggregated results after polls close; ability to open and close the election window.</w:t>
+        <w:t>time dashboard showing voter turnout per faculty, total votes cast vs. registered voters</w:t>
+      </w:r>
+      <w:r>
+        <w:rPr>
+          <w:rFonts w:ascii="Times New Roman" w:hAnsi="Times New Roman" w:cs="Times New Roman"/>
+        </w:rPr>
+        <w:t>.</w:t>
+      </w:r>
+    </w:p>
+    <w:p>
+      <w:pPr>
+        <w:pStyle w:val="ListParagraph"/>
+        <w:numPr>
+          <w:ilvl w:val="1"/>
+          <w:numId w:val="34"/>
+        </w:numPr>
+        <w:spacing w:line="360" w:lineRule="auto"/>
+        <w:rPr>
+          <w:rFonts w:ascii="Times New Roman" w:hAnsi="Times New Roman" w:cs="Times New Roman"/>
+        </w:rPr>
+      </w:pPr>
+      <w:r>
+        <w:rPr>
+          <w:rFonts w:ascii="Times New Roman" w:hAnsi="Times New Roman" w:cs="Times New Roman"/>
+        </w:rPr>
+        <w:t xml:space="preserve">View </w:t>
+      </w:r>
+      <w:r>
+        <w:rPr>
+          <w:rFonts w:ascii="Times New Roman" w:hAnsi="Times New Roman" w:cs="Times New Roman"/>
+        </w:rPr>
+        <w:t>aggregated results after polls close</w:t>
+      </w:r>
+      <w:r>
+        <w:rPr>
+          <w:rFonts w:ascii="Times New Roman" w:hAnsi="Times New Roman" w:cs="Times New Roman"/>
+        </w:rPr>
+        <w:t>.</w:t>
+      </w:r>
+    </w:p>
+    <w:p>
+      <w:pPr>
+        <w:pStyle w:val="ListParagraph"/>
+        <w:numPr>
+          <w:ilvl w:val="1"/>
+          <w:numId w:val="34"/>
+        </w:numPr>
+        <w:spacing w:line="360" w:lineRule="auto"/>
+        <w:rPr>
+          <w:rFonts w:ascii="Times New Roman" w:hAnsi="Times New Roman" w:cs="Times New Roman"/>
+        </w:rPr>
+      </w:pPr>
+      <w:r>
+        <w:rPr>
+          <w:rFonts w:ascii="Times New Roman" w:hAnsi="Times New Roman" w:cs="Times New Roman"/>
+        </w:rPr>
+        <w:t>Print election reports</w:t>
+      </w:r>
+    </w:p>
+    <w:p>
+      <w:pPr>
+        <w:pStyle w:val="ListParagraph"/>
+        <w:numPr>
+          <w:ilvl w:val="1"/>
+          <w:numId w:val="34"/>
+        </w:numPr>
+        <w:spacing w:line="360" w:lineRule="auto"/>
+        <w:rPr>
+          <w:rFonts w:ascii="Times New Roman" w:hAnsi="Times New Roman" w:cs="Times New Roman"/>
+        </w:rPr>
+      </w:pPr>
+      <w:r>
+        <w:rPr>
+          <w:rFonts w:ascii="Times New Roman" w:hAnsi="Times New Roman" w:cs="Times New Roman"/>
+        </w:rPr>
+        <w:t>Abi</w:t>
+      </w:r>
+      <w:r>
+        <w:rPr>
+          <w:rFonts w:ascii="Times New Roman" w:hAnsi="Times New Roman" w:cs="Times New Roman"/>
+        </w:rPr>
+        <w:t>lity to open and close the election window.</w:t>
       </w:r>
     </w:p>
     <w:p>
@@ -18326,14 +18591,144 @@
           <w:b/>
           <w:bCs/>
         </w:rPr>
-        <w:lastRenderedPageBreak/>
         <w:t>System Administrator</w:t>
       </w:r>
       <w:r>
         <w:rPr>
           <w:rFonts w:ascii="Times New Roman" w:hAnsi="Times New Roman" w:cs="Times New Roman"/>
         </w:rPr>
-        <w:t>: Manage candidate lists, configure election parameters, view comprehensive audit logs, and perform system backups.</w:t>
+        <w:t xml:space="preserve">: </w:t>
+      </w:r>
+    </w:p>
+    <w:p>
+      <w:pPr>
+        <w:pStyle w:val="ListParagraph"/>
+        <w:numPr>
+          <w:ilvl w:val="0"/>
+          <w:numId w:val="35"/>
+        </w:numPr>
+        <w:spacing w:line="360" w:lineRule="auto"/>
+        <w:rPr>
+          <w:rFonts w:ascii="Times New Roman" w:hAnsi="Times New Roman" w:cs="Times New Roman"/>
+        </w:rPr>
+      </w:pPr>
+      <w:r>
+        <w:rPr>
+          <w:rFonts w:ascii="Times New Roman" w:hAnsi="Times New Roman" w:cs="Times New Roman"/>
+        </w:rPr>
+        <w:t>Manage candidate lists</w:t>
+      </w:r>
+      <w:r>
+        <w:rPr>
+          <w:rFonts w:ascii="Times New Roman" w:hAnsi="Times New Roman" w:cs="Times New Roman"/>
+        </w:rPr>
+        <w:t xml:space="preserve"> and students.</w:t>
+      </w:r>
+    </w:p>
+    <w:p>
+      <w:pPr>
+        <w:pStyle w:val="ListParagraph"/>
+        <w:numPr>
+          <w:ilvl w:val="0"/>
+          <w:numId w:val="35"/>
+        </w:numPr>
+        <w:spacing w:line="360" w:lineRule="auto"/>
+        <w:rPr>
+          <w:rFonts w:ascii="Times New Roman" w:hAnsi="Times New Roman" w:cs="Times New Roman"/>
+        </w:rPr>
+      </w:pPr>
+      <w:r>
+        <w:rPr>
+          <w:rFonts w:ascii="Times New Roman" w:hAnsi="Times New Roman" w:cs="Times New Roman"/>
+        </w:rPr>
+        <w:t>Send messages to the students.</w:t>
+      </w:r>
+    </w:p>
+    <w:p>
+      <w:pPr>
+        <w:pStyle w:val="ListParagraph"/>
+        <w:numPr>
+          <w:ilvl w:val="0"/>
+          <w:numId w:val="35"/>
+        </w:numPr>
+        <w:spacing w:line="360" w:lineRule="auto"/>
+        <w:rPr>
+          <w:rFonts w:ascii="Times New Roman" w:hAnsi="Times New Roman" w:cs="Times New Roman"/>
+        </w:rPr>
+      </w:pPr>
+      <w:r>
+        <w:rPr>
+          <w:rFonts w:ascii="Times New Roman" w:hAnsi="Times New Roman" w:cs="Times New Roman"/>
+        </w:rPr>
+        <w:t>C</w:t>
+      </w:r>
+      <w:r>
+        <w:rPr>
+          <w:rFonts w:ascii="Times New Roman" w:hAnsi="Times New Roman" w:cs="Times New Roman"/>
+        </w:rPr>
+        <w:t>onfigure election parameters</w:t>
+      </w:r>
+      <w:r>
+        <w:rPr>
+          <w:rFonts w:ascii="Times New Roman" w:hAnsi="Times New Roman" w:cs="Times New Roman"/>
+        </w:rPr>
+        <w:t>.</w:t>
+      </w:r>
+    </w:p>
+    <w:p>
+      <w:pPr>
+        <w:pStyle w:val="ListParagraph"/>
+        <w:numPr>
+          <w:ilvl w:val="0"/>
+          <w:numId w:val="35"/>
+        </w:numPr>
+        <w:spacing w:line="360" w:lineRule="auto"/>
+        <w:rPr>
+          <w:rFonts w:ascii="Times New Roman" w:hAnsi="Times New Roman" w:cs="Times New Roman"/>
+        </w:rPr>
+      </w:pPr>
+      <w:r>
+        <w:rPr>
+          <w:rFonts w:ascii="Times New Roman" w:hAnsi="Times New Roman" w:cs="Times New Roman"/>
+        </w:rPr>
+        <w:t>V</w:t>
+      </w:r>
+      <w:r>
+        <w:rPr>
+          <w:rFonts w:ascii="Times New Roman" w:hAnsi="Times New Roman" w:cs="Times New Roman"/>
+        </w:rPr>
+        <w:t>iew comprehensive audit logs</w:t>
+      </w:r>
+      <w:r>
+        <w:rPr>
+          <w:rFonts w:ascii="Times New Roman" w:hAnsi="Times New Roman" w:cs="Times New Roman"/>
+        </w:rPr>
+        <w:t>.</w:t>
+      </w:r>
+    </w:p>
+    <w:p>
+      <w:pPr>
+        <w:pStyle w:val="ListParagraph"/>
+        <w:numPr>
+          <w:ilvl w:val="0"/>
+          <w:numId w:val="35"/>
+        </w:numPr>
+        <w:spacing w:line="360" w:lineRule="auto"/>
+        <w:rPr>
+          <w:rFonts w:ascii="Times New Roman" w:hAnsi="Times New Roman" w:cs="Times New Roman"/>
+        </w:rPr>
+      </w:pPr>
+      <w:r>
+        <w:rPr>
+          <w:rFonts w:ascii="Times New Roman" w:hAnsi="Times New Roman" w:cs="Times New Roman"/>
+        </w:rPr>
+        <w:t>P</w:t>
+      </w:r>
+      <w:r>
+        <w:rPr>
+          <w:rFonts w:ascii="Times New Roman" w:hAnsi="Times New Roman" w:cs="Times New Roman"/>
+        </w:rPr>
+        <w:t>erform system backups.</w:t>
       </w:r>
     </w:p>
     <w:p>
@@ -18764,6 +19159,7 @@
               <w:rPr>
                 <w:rFonts w:ascii="Times New Roman" w:hAnsi="Times New Roman" w:cs="Times New Roman"/>
               </w:rPr>
+              <w:lastRenderedPageBreak/>
               <w:t>Audit Logging</w:t>
             </w:r>
           </w:p>
@@ -18943,7 +19339,6 @@
           <w:b/>
           <w:bCs/>
         </w:rPr>
-        <w:lastRenderedPageBreak/>
         <w:t>Scalability</w:t>
       </w:r>
       <w:r>
@@ -23777,6 +24172,119 @@
 <file path=word/numbering.xml><?xml version="1.0" encoding="utf-8"?>
 <w:numbering xmlns:wpc="http://schemas.microsoft.com/office/word/2010/wordprocessingCanvas" xmlns:cx="http://schemas.microsoft.com/office/drawing/2014/chartex" xmlns:cx1="http://schemas.microsoft.com/office/drawing/2015/9/8/chartex" xmlns:cx2="http://schemas.microsoft.com/office/drawing/2015/10/21/chartex" xmlns:cx3="http://schemas.microsoft.com/office/drawing/2016/5/9/chartex" xmlns:cx4="http://schemas.microsoft.com/office/drawing/2016/5/10/chartex" xmlns:cx5="http://schemas.microsoft.com/office/drawing/2016/5/11/chartex" xmlns:cx6="http://schemas.microsoft.com/office/drawing/2016/5/12/chartex" xmlns:cx7="http://schemas.microsoft.com/office/drawing/2016/5/13/chartex" xmlns:cx8="http://schemas.microsoft.com/office/drawing/2016/5/14/chartex" xmlns:mc="http://schemas.openxmlformats.org/markup-compatibility/2006" xmlns:aink="http://schemas.microsoft.com/office/drawing/2016/ink" xmlns:am3d="http://schemas.microsoft.com/office/drawing/2017/model3d" xmlns:o="urn:schemas-microsoft-com:office:office" xmlns:oel="http://schemas.microsoft.com/office/2019/extlst" xmlns:r="http://schemas.openxmlformats.org/officeDocument/2006/relationships" xmlns:m="http://schemas.openxmlformats.org/officeDocument/2006/math" xmlns:v="urn:schemas-microsoft-com:vml" xmlns:wp14="http://schemas.microsoft.com/office/word/2010/wordprocessingDrawing" xmlns:wp="http://schemas.openxmlformats.org/drawingml/2006/wordprocessingDrawing" xmlns:w10="urn:schemas-microsoft-com:office:word" xmlns:w="http://schemas.openxmlformats.org/wordprocessingml/2006/main" xmlns:w14="http://schemas.microsoft.com/office/word/2010/wordml" xmlns:w15="http://schemas.microsoft.com/office/word/2012/wordml" xmlns:w16cex="http://schemas.microsoft.com/office/word/2018/wordml/cex" xmlns:w16cid="http://schemas.microsoft.com/office/word/2016/wordml/cid" xmlns:w16="http://schemas.microsoft.com/office/word/2018/wordml" xmlns:w16du="http://schemas.microsoft.com/office/word/2023/wordml/word16du" xmlns:w16sdtdh="http://schemas.microsoft.com/office/word/2020/wordml/sdtdatahash" xmlns:w16sdtfl="http://schemas.microsoft.com/office/word/2024/wordml/sdtformatlock" xmlns:w16se="http://schemas.microsoft.com/office/word/2015/wordml/symex" xmlns:wpg="http://schemas.microsoft.com/office/word/2010/wordprocessingGroup" xmlns:wpi="http://schemas.microsoft.com/office/word/2010/wordprocessingInk" xmlns:wne="http://schemas.microsoft.com/office/word/2006/wordml" xmlns:wps="http://schemas.microsoft.com/office/word/2010/wordprocessingShape" mc:Ignorable="w14 w15 w16se w16cid w16 w16cex w16sdtdh w16sdtfl w16du wp14">
   <w:abstractNum w:abstractNumId="0" w15:restartNumberingAfterBreak="0">
+    <w:nsid w:val="00113662"/>
+    <w:multiLevelType w:val="hybridMultilevel"/>
+    <w:tmpl w:val="2E5E3E48"/>
+    <w:lvl w:ilvl="0" w:tplc="0809000B">
+      <w:start w:val="1"/>
+      <w:numFmt w:val="bullet"/>
+      <w:lvlText w:val=""/>
+      <w:lvlJc w:val="left"/>
+      <w:pPr>
+        <w:ind w:left="1440" w:hanging="360"/>
+      </w:pPr>
+      <w:rPr>
+        <w:rFonts w:ascii="Wingdings" w:hAnsi="Wingdings" w:hint="default"/>
+      </w:rPr>
+    </w:lvl>
+    <w:lvl w:ilvl="1" w:tplc="08090003" w:tentative="1">
+      <w:start w:val="1"/>
+      <w:numFmt w:val="bullet"/>
+      <w:lvlText w:val="o"/>
+      <w:lvlJc w:val="left"/>
+      <w:pPr>
+        <w:ind w:left="2160" w:hanging="360"/>
+      </w:pPr>
+      <w:rPr>
+        <w:rFonts w:ascii="Courier New" w:hAnsi="Courier New" w:cs="Courier New" w:hint="default"/>
+      </w:rPr>
+    </w:lvl>
+    <w:lvl w:ilvl="2" w:tplc="08090005" w:tentative="1">
+      <w:start w:val="1"/>
+      <w:numFmt w:val="bullet"/>
+      <w:lvlText w:val=""/>
+      <w:lvlJc w:val="left"/>
+      <w:pPr>
+        <w:ind w:left="2880" w:hanging="360"/>
+      </w:pPr>
+      <w:rPr>
+        <w:rFonts w:ascii="Wingdings" w:hAnsi="Wingdings" w:hint="default"/>
+      </w:rPr>
+    </w:lvl>
+    <w:lvl w:ilvl="3" w:tplc="08090001" w:tentative="1">
+      <w:start w:val="1"/>
+      <w:numFmt w:val="bullet"/>
+      <w:lvlText w:val=""/>
+      <w:lvlJc w:val="left"/>
+      <w:pPr>
+        <w:ind w:left="3600" w:hanging="360"/>
+      </w:pPr>
+      <w:rPr>
+        <w:rFonts w:ascii="Symbol" w:hAnsi="Symbol" w:hint="default"/>
+      </w:rPr>
+    </w:lvl>
+    <w:lvl w:ilvl="4" w:tplc="08090003" w:tentative="1">
+      <w:start w:val="1"/>
+      <w:numFmt w:val="bullet"/>
+      <w:lvlText w:val="o"/>
+      <w:lvlJc w:val="left"/>
+      <w:pPr>
+        <w:ind w:left="4320" w:hanging="360"/>
+      </w:pPr>
+      <w:rPr>
+        <w:rFonts w:ascii="Courier New" w:hAnsi="Courier New" w:cs="Courier New" w:hint="default"/>
+      </w:rPr>
+    </w:lvl>
+    <w:lvl w:ilvl="5" w:tplc="08090005" w:tentative="1">
+      <w:start w:val="1"/>
+      <w:numFmt w:val="bullet"/>
+      <w:lvlText w:val=""/>
+      <w:lvlJc w:val="left"/>
+      <w:pPr>
+        <w:ind w:left="5040" w:hanging="360"/>
+      </w:pPr>
+      <w:rPr>
+        <w:rFonts w:ascii="Wingdings" w:hAnsi="Wingdings" w:hint="default"/>
+      </w:rPr>
+    </w:lvl>
+    <w:lvl w:ilvl="6" w:tplc="08090001" w:tentative="1">
+      <w:start w:val="1"/>
+      <w:numFmt w:val="bullet"/>
+      <w:lvlText w:val=""/>
+      <w:lvlJc w:val="left"/>
+      <w:pPr>
+        <w:ind w:left="5760" w:hanging="360"/>
+      </w:pPr>
+      <w:rPr>
+        <w:rFonts w:ascii="Symbol" w:hAnsi="Symbol" w:hint="default"/>
+      </w:rPr>
+    </w:lvl>
+    <w:lvl w:ilvl="7" w:tplc="08090003" w:tentative="1">
+      <w:start w:val="1"/>
+      <w:numFmt w:val="bullet"/>
+      <w:lvlText w:val="o"/>
+      <w:lvlJc w:val="left"/>
+      <w:pPr>
+        <w:ind w:left="6480" w:hanging="360"/>
+      </w:pPr>
+      <w:rPr>
+        <w:rFonts w:ascii="Courier New" w:hAnsi="Courier New" w:cs="Courier New" w:hint="default"/>
+      </w:rPr>
+    </w:lvl>
+    <w:lvl w:ilvl="8" w:tplc="08090005" w:tentative="1">
+      <w:start w:val="1"/>
+      <w:numFmt w:val="bullet"/>
+      <w:lvlText w:val=""/>
+      <w:lvlJc w:val="left"/>
+      <w:pPr>
+        <w:ind w:left="7200" w:hanging="360"/>
+      </w:pPr>
+      <w:rPr>
+        <w:rFonts w:ascii="Wingdings" w:hAnsi="Wingdings" w:hint="default"/>
+      </w:rPr>
+    </w:lvl>
+  </w:abstractNum>
+  <w:abstractNum w:abstractNumId="1" w15:restartNumberingAfterBreak="0">
     <w:nsid w:val="01D15203"/>
     <w:multiLevelType w:val="multilevel"/>
     <w:tmpl w:val="EDCC4948"/>
@@ -23889,7 +24397,7 @@
       </w:pPr>
     </w:lvl>
   </w:abstractNum>
-  <w:abstractNum w:abstractNumId="1" w15:restartNumberingAfterBreak="0">
+  <w:abstractNum w:abstractNumId="2" w15:restartNumberingAfterBreak="0">
     <w:nsid w:val="040320D7"/>
     <w:multiLevelType w:val="multilevel"/>
     <w:tmpl w:val="34CE3C0E"/>
@@ -24038,7 +24546,7 @@
       </w:rPr>
     </w:lvl>
   </w:abstractNum>
-  <w:abstractNum w:abstractNumId="2" w15:restartNumberingAfterBreak="0">
+  <w:abstractNum w:abstractNumId="3" w15:restartNumberingAfterBreak="0">
     <w:nsid w:val="04653AD2"/>
     <w:multiLevelType w:val="multilevel"/>
     <w:tmpl w:val="93C2F324"/>
@@ -24187,7 +24695,7 @@
       </w:rPr>
     </w:lvl>
   </w:abstractNum>
-  <w:abstractNum w:abstractNumId="3" w15:restartNumberingAfterBreak="0">
+  <w:abstractNum w:abstractNumId="4" w15:restartNumberingAfterBreak="0">
     <w:nsid w:val="0CA135CB"/>
     <w:multiLevelType w:val="multilevel"/>
     <w:tmpl w:val="CA3E3CBC"/>
@@ -24336,7 +24844,7 @@
       </w:rPr>
     </w:lvl>
   </w:abstractNum>
-  <w:abstractNum w:abstractNumId="4" w15:restartNumberingAfterBreak="0">
+  <w:abstractNum w:abstractNumId="5" w15:restartNumberingAfterBreak="0">
     <w:nsid w:val="0DFF2915"/>
     <w:multiLevelType w:val="multilevel"/>
     <w:tmpl w:val="7A34B028"/>
@@ -24449,7 +24957,120 @@
       </w:pPr>
     </w:lvl>
   </w:abstractNum>
-  <w:abstractNum w:abstractNumId="5" w15:restartNumberingAfterBreak="0">
+  <w:abstractNum w:abstractNumId="6" w15:restartNumberingAfterBreak="0">
+    <w:nsid w:val="0E660956"/>
+    <w:multiLevelType w:val="hybridMultilevel"/>
+    <w:tmpl w:val="BEC2D07C"/>
+    <w:lvl w:ilvl="0" w:tplc="0809000B">
+      <w:start w:val="1"/>
+      <w:numFmt w:val="bullet"/>
+      <w:lvlText w:val=""/>
+      <w:lvlJc w:val="left"/>
+      <w:pPr>
+        <w:ind w:left="1440" w:hanging="360"/>
+      </w:pPr>
+      <w:rPr>
+        <w:rFonts w:ascii="Wingdings" w:hAnsi="Wingdings" w:hint="default"/>
+      </w:rPr>
+    </w:lvl>
+    <w:lvl w:ilvl="1" w:tplc="08090003" w:tentative="1">
+      <w:start w:val="1"/>
+      <w:numFmt w:val="bullet"/>
+      <w:lvlText w:val="o"/>
+      <w:lvlJc w:val="left"/>
+      <w:pPr>
+        <w:ind w:left="2160" w:hanging="360"/>
+      </w:pPr>
+      <w:rPr>
+        <w:rFonts w:ascii="Courier New" w:hAnsi="Courier New" w:cs="Courier New" w:hint="default"/>
+      </w:rPr>
+    </w:lvl>
+    <w:lvl w:ilvl="2" w:tplc="08090005" w:tentative="1">
+      <w:start w:val="1"/>
+      <w:numFmt w:val="bullet"/>
+      <w:lvlText w:val=""/>
+      <w:lvlJc w:val="left"/>
+      <w:pPr>
+        <w:ind w:left="2880" w:hanging="360"/>
+      </w:pPr>
+      <w:rPr>
+        <w:rFonts w:ascii="Wingdings" w:hAnsi="Wingdings" w:hint="default"/>
+      </w:rPr>
+    </w:lvl>
+    <w:lvl w:ilvl="3" w:tplc="08090001" w:tentative="1">
+      <w:start w:val="1"/>
+      <w:numFmt w:val="bullet"/>
+      <w:lvlText w:val=""/>
+      <w:lvlJc w:val="left"/>
+      <w:pPr>
+        <w:ind w:left="3600" w:hanging="360"/>
+      </w:pPr>
+      <w:rPr>
+        <w:rFonts w:ascii="Symbol" w:hAnsi="Symbol" w:hint="default"/>
+      </w:rPr>
+    </w:lvl>
+    <w:lvl w:ilvl="4" w:tplc="08090003" w:tentative="1">
+      <w:start w:val="1"/>
+      <w:numFmt w:val="bullet"/>
+      <w:lvlText w:val="o"/>
+      <w:lvlJc w:val="left"/>
+      <w:pPr>
+        <w:ind w:left="4320" w:hanging="360"/>
+      </w:pPr>
+      <w:rPr>
+        <w:rFonts w:ascii="Courier New" w:hAnsi="Courier New" w:cs="Courier New" w:hint="default"/>
+      </w:rPr>
+    </w:lvl>
+    <w:lvl w:ilvl="5" w:tplc="08090005" w:tentative="1">
+      <w:start w:val="1"/>
+      <w:numFmt w:val="bullet"/>
+      <w:lvlText w:val=""/>
+      <w:lvlJc w:val="left"/>
+      <w:pPr>
+        <w:ind w:left="5040" w:hanging="360"/>
+      </w:pPr>
+      <w:rPr>
+        <w:rFonts w:ascii="Wingdings" w:hAnsi="Wingdings" w:hint="default"/>
+      </w:rPr>
+    </w:lvl>
+    <w:lvl w:ilvl="6" w:tplc="08090001" w:tentative="1">
+      <w:start w:val="1"/>
+      <w:numFmt w:val="bullet"/>
+      <w:lvlText w:val=""/>
+      <w:lvlJc w:val="left"/>
+      <w:pPr>
+        <w:ind w:left="5760" w:hanging="360"/>
+      </w:pPr>
+      <w:rPr>
+        <w:rFonts w:ascii="Symbol" w:hAnsi="Symbol" w:hint="default"/>
+      </w:rPr>
+    </w:lvl>
+    <w:lvl w:ilvl="7" w:tplc="08090003" w:tentative="1">
+      <w:start w:val="1"/>
+      <w:numFmt w:val="bullet"/>
+      <w:lvlText w:val="o"/>
+      <w:lvlJc w:val="left"/>
+      <w:pPr>
+        <w:ind w:left="6480" w:hanging="360"/>
+      </w:pPr>
+      <w:rPr>
+        <w:rFonts w:ascii="Courier New" w:hAnsi="Courier New" w:cs="Courier New" w:hint="default"/>
+      </w:rPr>
+    </w:lvl>
+    <w:lvl w:ilvl="8" w:tplc="08090005" w:tentative="1">
+      <w:start w:val="1"/>
+      <w:numFmt w:val="bullet"/>
+      <w:lvlText w:val=""/>
+      <w:lvlJc w:val="left"/>
+      <w:pPr>
+        <w:ind w:left="7200" w:hanging="360"/>
+      </w:pPr>
+      <w:rPr>
+        <w:rFonts w:ascii="Wingdings" w:hAnsi="Wingdings" w:hint="default"/>
+      </w:rPr>
+    </w:lvl>
+  </w:abstractNum>
+  <w:abstractNum w:abstractNumId="7" w15:restartNumberingAfterBreak="0">
     <w:nsid w:val="10165CDE"/>
     <w:multiLevelType w:val="multilevel"/>
     <w:tmpl w:val="13A89738"/>
@@ -24598,7 +25219,7 @@
       </w:rPr>
     </w:lvl>
   </w:abstractNum>
-  <w:abstractNum w:abstractNumId="6" w15:restartNumberingAfterBreak="0">
+  <w:abstractNum w:abstractNumId="8" w15:restartNumberingAfterBreak="0">
     <w:nsid w:val="111620A3"/>
     <w:multiLevelType w:val="hybridMultilevel"/>
     <w:tmpl w:val="36AA9A02"/>
@@ -24711,7 +25332,7 @@
       </w:rPr>
     </w:lvl>
   </w:abstractNum>
-  <w:abstractNum w:abstractNumId="7" w15:restartNumberingAfterBreak="0">
+  <w:abstractNum w:abstractNumId="9" w15:restartNumberingAfterBreak="0">
     <w:nsid w:val="14565351"/>
     <w:multiLevelType w:val="multilevel"/>
     <w:tmpl w:val="38F431FA"/>
@@ -24860,7 +25481,7 @@
       </w:rPr>
     </w:lvl>
   </w:abstractNum>
-  <w:abstractNum w:abstractNumId="8" w15:restartNumberingAfterBreak="0">
+  <w:abstractNum w:abstractNumId="10" w15:restartNumberingAfterBreak="0">
     <w:nsid w:val="1AED29A7"/>
     <w:multiLevelType w:val="multilevel"/>
     <w:tmpl w:val="4586868C"/>
@@ -25009,7 +25630,7 @@
       </w:rPr>
     </w:lvl>
   </w:abstractNum>
-  <w:abstractNum w:abstractNumId="9" w15:restartNumberingAfterBreak="0">
+  <w:abstractNum w:abstractNumId="11" w15:restartNumberingAfterBreak="0">
     <w:nsid w:val="1CBB6A0C"/>
     <w:multiLevelType w:val="multilevel"/>
     <w:tmpl w:val="23921282"/>
@@ -25158,7 +25779,7 @@
       </w:rPr>
     </w:lvl>
   </w:abstractNum>
-  <w:abstractNum w:abstractNumId="10" w15:restartNumberingAfterBreak="0">
+  <w:abstractNum w:abstractNumId="12" w15:restartNumberingAfterBreak="0">
     <w:nsid w:val="260E1460"/>
     <w:multiLevelType w:val="multilevel"/>
     <w:tmpl w:val="92C410DC"/>
@@ -25178,7 +25799,7 @@
         <w:sz w:val="20"/>
       </w:rPr>
     </w:lvl>
-    <w:lvl w:ilvl="1" w:tentative="1">
+    <w:lvl w:ilvl="1">
       <w:start w:val="1"/>
       <w:numFmt w:val="bullet"/>
       <w:lvlText w:val="o"/>
@@ -25307,7 +25928,7 @@
       </w:rPr>
     </w:lvl>
   </w:abstractNum>
-  <w:abstractNum w:abstractNumId="11" w15:restartNumberingAfterBreak="0">
+  <w:abstractNum w:abstractNumId="13" w15:restartNumberingAfterBreak="0">
     <w:nsid w:val="2D68297E"/>
     <w:multiLevelType w:val="hybridMultilevel"/>
     <w:tmpl w:val="A2F2B7BC"/>
@@ -25420,7 +26041,7 @@
       </w:rPr>
     </w:lvl>
   </w:abstractNum>
-  <w:abstractNum w:abstractNumId="12" w15:restartNumberingAfterBreak="0">
+  <w:abstractNum w:abstractNumId="14" w15:restartNumberingAfterBreak="0">
     <w:nsid w:val="2FAC15C4"/>
     <w:multiLevelType w:val="multilevel"/>
     <w:tmpl w:val="5ED80A38"/>
@@ -25569,7 +26190,7 @@
       </w:rPr>
     </w:lvl>
   </w:abstractNum>
-  <w:abstractNum w:abstractNumId="13" w15:restartNumberingAfterBreak="0">
+  <w:abstractNum w:abstractNumId="15" w15:restartNumberingAfterBreak="0">
     <w:nsid w:val="32BB5D33"/>
     <w:multiLevelType w:val="multilevel"/>
     <w:tmpl w:val="61988FA4"/>
@@ -25718,7 +26339,7 @@
       </w:rPr>
     </w:lvl>
   </w:abstractNum>
-  <w:abstractNum w:abstractNumId="14" w15:restartNumberingAfterBreak="0">
+  <w:abstractNum w:abstractNumId="16" w15:restartNumberingAfterBreak="0">
     <w:nsid w:val="32E829E5"/>
     <w:multiLevelType w:val="multilevel"/>
     <w:tmpl w:val="C99A8F2C"/>
@@ -25867,7 +26488,7 @@
       </w:rPr>
     </w:lvl>
   </w:abstractNum>
-  <w:abstractNum w:abstractNumId="15" w15:restartNumberingAfterBreak="0">
+  <w:abstractNum w:abstractNumId="17" w15:restartNumberingAfterBreak="0">
     <w:nsid w:val="37C42699"/>
     <w:multiLevelType w:val="multilevel"/>
     <w:tmpl w:val="E402BC58"/>
@@ -26016,7 +26637,7 @@
       </w:rPr>
     </w:lvl>
   </w:abstractNum>
-  <w:abstractNum w:abstractNumId="16" w15:restartNumberingAfterBreak="0">
+  <w:abstractNum w:abstractNumId="18" w15:restartNumberingAfterBreak="0">
     <w:nsid w:val="394840F4"/>
     <w:multiLevelType w:val="multilevel"/>
     <w:tmpl w:val="3982B3A6"/>
@@ -26129,7 +26750,7 @@
       </w:pPr>
     </w:lvl>
   </w:abstractNum>
-  <w:abstractNum w:abstractNumId="17" w15:restartNumberingAfterBreak="0">
+  <w:abstractNum w:abstractNumId="19" w15:restartNumberingAfterBreak="0">
     <w:nsid w:val="3A7D14D4"/>
     <w:multiLevelType w:val="multilevel"/>
     <w:tmpl w:val="97F41B86"/>
@@ -26242,7 +26863,7 @@
       </w:pPr>
     </w:lvl>
   </w:abstractNum>
-  <w:abstractNum w:abstractNumId="18" w15:restartNumberingAfterBreak="0">
+  <w:abstractNum w:abstractNumId="20" w15:restartNumberingAfterBreak="0">
     <w:nsid w:val="3CB24445"/>
     <w:multiLevelType w:val="multilevel"/>
     <w:tmpl w:val="9100185A"/>
@@ -26391,7 +27012,7 @@
       </w:rPr>
     </w:lvl>
   </w:abstractNum>
-  <w:abstractNum w:abstractNumId="19" w15:restartNumberingAfterBreak="0">
+  <w:abstractNum w:abstractNumId="21" w15:restartNumberingAfterBreak="0">
     <w:nsid w:val="3D3F47A9"/>
     <w:multiLevelType w:val="multilevel"/>
     <w:tmpl w:val="B150FDD2"/>
@@ -26540,7 +27161,7 @@
       </w:rPr>
     </w:lvl>
   </w:abstractNum>
-  <w:abstractNum w:abstractNumId="20" w15:restartNumberingAfterBreak="0">
+  <w:abstractNum w:abstractNumId="22" w15:restartNumberingAfterBreak="0">
     <w:nsid w:val="3F473C28"/>
     <w:multiLevelType w:val="multilevel"/>
     <w:tmpl w:val="F19ECC0A"/>
@@ -26689,7 +27310,7 @@
       </w:rPr>
     </w:lvl>
   </w:abstractNum>
-  <w:abstractNum w:abstractNumId="21" w15:restartNumberingAfterBreak="0">
+  <w:abstractNum w:abstractNumId="23" w15:restartNumberingAfterBreak="0">
     <w:nsid w:val="40B40963"/>
     <w:multiLevelType w:val="multilevel"/>
     <w:tmpl w:val="B3ECDC6E"/>
@@ -26802,7 +27423,152 @@
       </w:pPr>
     </w:lvl>
   </w:abstractNum>
-  <w:abstractNum w:abstractNumId="22" w15:restartNumberingAfterBreak="0">
+  <w:abstractNum w:abstractNumId="24" w15:restartNumberingAfterBreak="0">
+    <w:nsid w:val="40FE2212"/>
+    <w:multiLevelType w:val="multilevel"/>
+    <w:tmpl w:val="920677BA"/>
+    <w:lvl w:ilvl="0">
+      <w:start w:val="1"/>
+      <w:numFmt w:val="bullet"/>
+      <w:lvlText w:val=""/>
+      <w:lvlJc w:val="left"/>
+      <w:pPr>
+        <w:tabs>
+          <w:tab w:val="num" w:pos="720"/>
+        </w:tabs>
+        <w:ind w:left="720" w:hanging="360"/>
+      </w:pPr>
+      <w:rPr>
+        <w:rFonts w:ascii="Symbol" w:hAnsi="Symbol" w:hint="default"/>
+        <w:sz w:val="20"/>
+      </w:rPr>
+    </w:lvl>
+    <w:lvl w:ilvl="1">
+      <w:start w:val="1"/>
+      <w:numFmt w:val="bullet"/>
+      <w:lvlText w:val=""/>
+      <w:lvlJc w:val="left"/>
+      <w:pPr>
+        <w:ind w:left="1440" w:hanging="360"/>
+      </w:pPr>
+      <w:rPr>
+        <w:rFonts w:ascii="Wingdings" w:hAnsi="Wingdings" w:hint="default"/>
+      </w:rPr>
+    </w:lvl>
+    <w:lvl w:ilvl="2" w:tentative="1">
+      <w:start w:val="1"/>
+      <w:numFmt w:val="bullet"/>
+      <w:lvlText w:val=""/>
+      <w:lvlJc w:val="left"/>
+      <w:pPr>
+        <w:tabs>
+          <w:tab w:val="num" w:pos="2160"/>
+        </w:tabs>
+        <w:ind w:left="2160" w:hanging="360"/>
+      </w:pPr>
+      <w:rPr>
+        <w:rFonts w:ascii="Wingdings" w:hAnsi="Wingdings" w:hint="default"/>
+        <w:sz w:val="20"/>
+      </w:rPr>
+    </w:lvl>
+    <w:lvl w:ilvl="3" w:tentative="1">
+      <w:start w:val="1"/>
+      <w:numFmt w:val="bullet"/>
+      <w:lvlText w:val=""/>
+      <w:lvlJc w:val="left"/>
+      <w:pPr>
+        <w:tabs>
+          <w:tab w:val="num" w:pos="2880"/>
+        </w:tabs>
+        <w:ind w:left="2880" w:hanging="360"/>
+      </w:pPr>
+      <w:rPr>
+        <w:rFonts w:ascii="Wingdings" w:hAnsi="Wingdings" w:hint="default"/>
+        <w:sz w:val="20"/>
+      </w:rPr>
+    </w:lvl>
+    <w:lvl w:ilvl="4" w:tentative="1">
+      <w:start w:val="1"/>
+      <w:numFmt w:val="bullet"/>
+      <w:lvlText w:val=""/>
+      <w:lvlJc w:val="left"/>
+      <w:pPr>
+        <w:tabs>
+          <w:tab w:val="num" w:pos="3600"/>
+        </w:tabs>
+        <w:ind w:left="3600" w:hanging="360"/>
+      </w:pPr>
+      <w:rPr>
+        <w:rFonts w:ascii="Wingdings" w:hAnsi="Wingdings" w:hint="default"/>
+        <w:sz w:val="20"/>
+      </w:rPr>
+    </w:lvl>
+    <w:lvl w:ilvl="5" w:tentative="1">
+      <w:start w:val="1"/>
+      <w:numFmt w:val="bullet"/>
+      <w:lvlText w:val=""/>
+      <w:lvlJc w:val="left"/>
+      <w:pPr>
+        <w:tabs>
+          <w:tab w:val="num" w:pos="4320"/>
+        </w:tabs>
+        <w:ind w:left="4320" w:hanging="360"/>
+      </w:pPr>
+      <w:rPr>
+        <w:rFonts w:ascii="Wingdings" w:hAnsi="Wingdings" w:hint="default"/>
+        <w:sz w:val="20"/>
+      </w:rPr>
+    </w:lvl>
+    <w:lvl w:ilvl="6" w:tentative="1">
+      <w:start w:val="1"/>
+      <w:numFmt w:val="bullet"/>
+      <w:lvlText w:val=""/>
+      <w:lvlJc w:val="left"/>
+      <w:pPr>
+        <w:tabs>
+          <w:tab w:val="num" w:pos="5040"/>
+        </w:tabs>
+        <w:ind w:left="5040" w:hanging="360"/>
+      </w:pPr>
+      <w:rPr>
+        <w:rFonts w:ascii="Wingdings" w:hAnsi="Wingdings" w:hint="default"/>
+        <w:sz w:val="20"/>
+      </w:rPr>
+    </w:lvl>
+    <w:lvl w:ilvl="7" w:tentative="1">
+      <w:start w:val="1"/>
+      <w:numFmt w:val="bullet"/>
+      <w:lvlText w:val=""/>
+      <w:lvlJc w:val="left"/>
+      <w:pPr>
+        <w:tabs>
+          <w:tab w:val="num" w:pos="5760"/>
+        </w:tabs>
+        <w:ind w:left="5760" w:hanging="360"/>
+      </w:pPr>
+      <w:rPr>
+        <w:rFonts w:ascii="Wingdings" w:hAnsi="Wingdings" w:hint="default"/>
+        <w:sz w:val="20"/>
+      </w:rPr>
+    </w:lvl>
+    <w:lvl w:ilvl="8" w:tentative="1">
+      <w:start w:val="1"/>
+      <w:numFmt w:val="bullet"/>
+      <w:lvlText w:val=""/>
+      <w:lvlJc w:val="left"/>
+      <w:pPr>
+        <w:tabs>
+          <w:tab w:val="num" w:pos="6480"/>
+        </w:tabs>
+        <w:ind w:left="6480" w:hanging="360"/>
+      </w:pPr>
+      <w:rPr>
+        <w:rFonts w:ascii="Wingdings" w:hAnsi="Wingdings" w:hint="default"/>
+        <w:sz w:val="20"/>
+      </w:rPr>
+    </w:lvl>
+  </w:abstractNum>
+  <w:abstractNum w:abstractNumId="25" w15:restartNumberingAfterBreak="0">
     <w:nsid w:val="49E92953"/>
     <w:multiLevelType w:val="multilevel"/>
     <w:tmpl w:val="033EAEA0"/>
@@ -26951,7 +27717,7 @@
       </w:rPr>
     </w:lvl>
   </w:abstractNum>
-  <w:abstractNum w:abstractNumId="23" w15:restartNumberingAfterBreak="0">
+  <w:abstractNum w:abstractNumId="26" w15:restartNumberingAfterBreak="0">
     <w:nsid w:val="4D034319"/>
     <w:multiLevelType w:val="multilevel"/>
     <w:tmpl w:val="C17EAB48"/>
@@ -27100,7 +27866,7 @@
       </w:rPr>
     </w:lvl>
   </w:abstractNum>
-  <w:abstractNum w:abstractNumId="24" w15:restartNumberingAfterBreak="0">
+  <w:abstractNum w:abstractNumId="27" w15:restartNumberingAfterBreak="0">
     <w:nsid w:val="57035298"/>
     <w:multiLevelType w:val="multilevel"/>
     <w:tmpl w:val="AA4A7958"/>
@@ -27249,7 +28015,7 @@
       </w:rPr>
     </w:lvl>
   </w:abstractNum>
-  <w:abstractNum w:abstractNumId="25" w15:restartNumberingAfterBreak="0">
+  <w:abstractNum w:abstractNumId="28" w15:restartNumberingAfterBreak="0">
     <w:nsid w:val="57285689"/>
     <w:multiLevelType w:val="multilevel"/>
     <w:tmpl w:val="38F68E2C"/>
@@ -27398,7 +28164,7 @@
       </w:rPr>
     </w:lvl>
   </w:abstractNum>
-  <w:abstractNum w:abstractNumId="26" w15:restartNumberingAfterBreak="0">
+  <w:abstractNum w:abstractNumId="29" w15:restartNumberingAfterBreak="0">
     <w:nsid w:val="5C1C62C7"/>
     <w:multiLevelType w:val="multilevel"/>
     <w:tmpl w:val="67E8A606"/>
@@ -27547,7 +28313,7 @@
       </w:rPr>
     </w:lvl>
   </w:abstractNum>
-  <w:abstractNum w:abstractNumId="27" w15:restartNumberingAfterBreak="0">
+  <w:abstractNum w:abstractNumId="30" w15:restartNumberingAfterBreak="0">
     <w:nsid w:val="6008702F"/>
     <w:multiLevelType w:val="multilevel"/>
     <w:tmpl w:val="3948FB80"/>
@@ -27660,7 +28426,7 @@
       </w:pPr>
     </w:lvl>
   </w:abstractNum>
-  <w:abstractNum w:abstractNumId="28" w15:restartNumberingAfterBreak="0">
+  <w:abstractNum w:abstractNumId="31" w15:restartNumberingAfterBreak="0">
     <w:nsid w:val="642A6588"/>
     <w:multiLevelType w:val="hybridMultilevel"/>
     <w:tmpl w:val="57109C14"/>
@@ -27773,7 +28539,7 @@
       </w:rPr>
     </w:lvl>
   </w:abstractNum>
-  <w:abstractNum w:abstractNumId="29" w15:restartNumberingAfterBreak="0">
+  <w:abstractNum w:abstractNumId="32" w15:restartNumberingAfterBreak="0">
     <w:nsid w:val="6A9D47D2"/>
     <w:multiLevelType w:val="multilevel"/>
     <w:tmpl w:val="09568D00"/>
@@ -27886,7 +28652,7 @@
       </w:pPr>
     </w:lvl>
   </w:abstractNum>
-  <w:abstractNum w:abstractNumId="30" w15:restartNumberingAfterBreak="0">
+  <w:abstractNum w:abstractNumId="33" w15:restartNumberingAfterBreak="0">
     <w:nsid w:val="716B787B"/>
     <w:multiLevelType w:val="multilevel"/>
     <w:tmpl w:val="C0DC33CC"/>
@@ -28035,7 +28801,7 @@
       </w:rPr>
     </w:lvl>
   </w:abstractNum>
-  <w:abstractNum w:abstractNumId="31" w15:restartNumberingAfterBreak="0">
+  <w:abstractNum w:abstractNumId="34" w15:restartNumberingAfterBreak="0">
     <w:nsid w:val="78617171"/>
     <w:multiLevelType w:val="multilevel"/>
     <w:tmpl w:val="7DCC9736"/>
@@ -28149,100 +28915,109 @@
     </w:lvl>
   </w:abstractNum>
   <w:num w:numId="1" w16cid:durableId="1798913798">
+    <w:abstractNumId w:val="32"/>
+  </w:num>
+  <w:num w:numId="2" w16cid:durableId="906767323">
+    <w:abstractNumId w:val="34"/>
+  </w:num>
+  <w:num w:numId="3" w16cid:durableId="2093812367">
+    <w:abstractNumId w:val="16"/>
+  </w:num>
+  <w:num w:numId="4" w16cid:durableId="1966080473">
+    <w:abstractNumId w:val="15"/>
+  </w:num>
+  <w:num w:numId="5" w16cid:durableId="746001315">
+    <w:abstractNumId w:val="4"/>
+  </w:num>
+  <w:num w:numId="6" w16cid:durableId="1268612366">
+    <w:abstractNumId w:val="20"/>
+  </w:num>
+  <w:num w:numId="7" w16cid:durableId="1875800688">
+    <w:abstractNumId w:val="30"/>
+  </w:num>
+  <w:num w:numId="8" w16cid:durableId="1531801930">
+    <w:abstractNumId w:val="9"/>
+  </w:num>
+  <w:num w:numId="9" w16cid:durableId="628438803">
+    <w:abstractNumId w:val="22"/>
+  </w:num>
+  <w:num w:numId="10" w16cid:durableId="514654642">
+    <w:abstractNumId w:val="10"/>
+  </w:num>
+  <w:num w:numId="11" w16cid:durableId="411317466">
+    <w:abstractNumId w:val="17"/>
+  </w:num>
+  <w:num w:numId="12" w16cid:durableId="1401294775">
     <w:abstractNumId w:val="29"/>
   </w:num>
-  <w:num w:numId="2" w16cid:durableId="906767323">
+  <w:num w:numId="13" w16cid:durableId="1078945890">
+    <w:abstractNumId w:val="5"/>
+  </w:num>
+  <w:num w:numId="14" w16cid:durableId="1293709898">
+    <w:abstractNumId w:val="28"/>
+  </w:num>
+  <w:num w:numId="15" w16cid:durableId="2068071486">
+    <w:abstractNumId w:val="23"/>
+  </w:num>
+  <w:num w:numId="16" w16cid:durableId="1093822707">
+    <w:abstractNumId w:val="26"/>
+  </w:num>
+  <w:num w:numId="17" w16cid:durableId="728767103">
+    <w:abstractNumId w:val="2"/>
+  </w:num>
+  <w:num w:numId="18" w16cid:durableId="69235766">
+    <w:abstractNumId w:val="12"/>
+  </w:num>
+  <w:num w:numId="19" w16cid:durableId="869537036">
+    <w:abstractNumId w:val="33"/>
+  </w:num>
+  <w:num w:numId="20" w16cid:durableId="698629969">
+    <w:abstractNumId w:val="11"/>
+  </w:num>
+  <w:num w:numId="21" w16cid:durableId="727607561">
+    <w:abstractNumId w:val="18"/>
+  </w:num>
+  <w:num w:numId="22" w16cid:durableId="1827475983">
+    <w:abstractNumId w:val="25"/>
+  </w:num>
+  <w:num w:numId="23" w16cid:durableId="639727016">
+    <w:abstractNumId w:val="3"/>
+  </w:num>
+  <w:num w:numId="24" w16cid:durableId="1981494923">
+    <w:abstractNumId w:val="7"/>
+  </w:num>
+  <w:num w:numId="25" w16cid:durableId="299387637">
+    <w:abstractNumId w:val="19"/>
+  </w:num>
+  <w:num w:numId="26" w16cid:durableId="1668243213">
+    <w:abstractNumId w:val="27"/>
+  </w:num>
+  <w:num w:numId="27" w16cid:durableId="2128113801">
+    <w:abstractNumId w:val="21"/>
+  </w:num>
+  <w:num w:numId="28" w16cid:durableId="1760953518">
+    <w:abstractNumId w:val="1"/>
+  </w:num>
+  <w:num w:numId="29" w16cid:durableId="1155225927">
+    <w:abstractNumId w:val="14"/>
+  </w:num>
+  <w:num w:numId="30" w16cid:durableId="158158993">
+    <w:abstractNumId w:val="8"/>
+  </w:num>
+  <w:num w:numId="31" w16cid:durableId="981618403">
+    <w:abstractNumId w:val="13"/>
+  </w:num>
+  <w:num w:numId="32" w16cid:durableId="381754702">
     <w:abstractNumId w:val="31"/>
   </w:num>
-  <w:num w:numId="3" w16cid:durableId="2093812367">
-    <w:abstractNumId w:val="14"/>
+  <w:num w:numId="33" w16cid:durableId="1819031368">
+    <w:abstractNumId w:val="0"/>
   </w:num>
-  <w:num w:numId="4" w16cid:durableId="1966080473">
-    <w:abstractNumId w:val="13"/>
-  </w:num>
-  <w:num w:numId="5" w16cid:durableId="746001315">
-    <w:abstractNumId w:val="3"/>
-  </w:num>
-  <w:num w:numId="6" w16cid:durableId="1268612366">
-    <w:abstractNumId w:val="18"/>
-  </w:num>
-  <w:num w:numId="7" w16cid:durableId="1875800688">
-    <w:abstractNumId w:val="27"/>
-  </w:num>
-  <w:num w:numId="8" w16cid:durableId="1531801930">
-    <w:abstractNumId w:val="7"/>
-  </w:num>
-  <w:num w:numId="9" w16cid:durableId="628438803">
-    <w:abstractNumId w:val="20"/>
-  </w:num>
-  <w:num w:numId="10" w16cid:durableId="514654642">
-    <w:abstractNumId w:val="8"/>
-  </w:num>
-  <w:num w:numId="11" w16cid:durableId="411317466">
-    <w:abstractNumId w:val="15"/>
-  </w:num>
-  <w:num w:numId="12" w16cid:durableId="1401294775">
-    <w:abstractNumId w:val="26"/>
-  </w:num>
-  <w:num w:numId="13" w16cid:durableId="1078945890">
-    <w:abstractNumId w:val="4"/>
-  </w:num>
-  <w:num w:numId="14" w16cid:durableId="1293709898">
-    <w:abstractNumId w:val="25"/>
-  </w:num>
-  <w:num w:numId="15" w16cid:durableId="2068071486">
-    <w:abstractNumId w:val="21"/>
-  </w:num>
-  <w:num w:numId="16" w16cid:durableId="1093822707">
-    <w:abstractNumId w:val="23"/>
-  </w:num>
-  <w:num w:numId="17" w16cid:durableId="728767103">
-    <w:abstractNumId w:val="1"/>
-  </w:num>
-  <w:num w:numId="18" w16cid:durableId="69235766">
-    <w:abstractNumId w:val="10"/>
-  </w:num>
-  <w:num w:numId="19" w16cid:durableId="869537036">
-    <w:abstractNumId w:val="30"/>
-  </w:num>
-  <w:num w:numId="20" w16cid:durableId="698629969">
-    <w:abstractNumId w:val="9"/>
-  </w:num>
-  <w:num w:numId="21" w16cid:durableId="727607561">
-    <w:abstractNumId w:val="16"/>
-  </w:num>
-  <w:num w:numId="22" w16cid:durableId="1827475983">
-    <w:abstractNumId w:val="22"/>
-  </w:num>
-  <w:num w:numId="23" w16cid:durableId="639727016">
-    <w:abstractNumId w:val="2"/>
-  </w:num>
-  <w:num w:numId="24" w16cid:durableId="1981494923">
-    <w:abstractNumId w:val="5"/>
-  </w:num>
-  <w:num w:numId="25" w16cid:durableId="299387637">
-    <w:abstractNumId w:val="17"/>
-  </w:num>
-  <w:num w:numId="26" w16cid:durableId="1668243213">
+  <w:num w:numId="34" w16cid:durableId="1027171439">
     <w:abstractNumId w:val="24"/>
   </w:num>
-  <w:num w:numId="27" w16cid:durableId="2128113801">
-    <w:abstractNumId w:val="19"/>
-  </w:num>
-  <w:num w:numId="28" w16cid:durableId="1760953518">
-    <w:abstractNumId w:val="0"/>
-  </w:num>
-  <w:num w:numId="29" w16cid:durableId="1155225927">
-    <w:abstractNumId w:val="12"/>
-  </w:num>
-  <w:num w:numId="30" w16cid:durableId="158158993">
+  <w:num w:numId="35" w16cid:durableId="67659983">
     <w:abstractNumId w:val="6"/>
-  </w:num>
-  <w:num w:numId="31" w16cid:durableId="981618403">
-    <w:abstractNumId w:val="11"/>
-  </w:num>
-  <w:num w:numId="32" w16cid:durableId="381754702">
-    <w:abstractNumId w:val="28"/>
   </w:num>
 </w:numbering>
 </file>
@@ -28851,6 +29626,7 @@
   <w:style w:type="character" w:default="1" w:styleId="DefaultParagraphFont">
     <w:name w:val="Default Paragraph Font"/>
     <w:uiPriority w:val="1"/>
+    <w:semiHidden/>
     <w:unhideWhenUsed/>
   </w:style>
   <w:style w:type="table" w:default="1" w:styleId="TableNormal">
@@ -29490,10 +30266,10 @@
 
 <file path=word/glossary/fontTable.xml><?xml version="1.0" encoding="utf-8"?>
 <w:fonts xmlns:mc="http://schemas.openxmlformats.org/markup-compatibility/2006" xmlns:r="http://schemas.openxmlformats.org/officeDocument/2006/relationships" xmlns:w="http://schemas.openxmlformats.org/wordprocessingml/2006/main" xmlns:w14="http://schemas.microsoft.com/office/word/2010/wordml" xmlns:w15="http://schemas.microsoft.com/office/word/2012/wordml" xmlns:w16cex="http://schemas.microsoft.com/office/word/2018/wordml/cex" xmlns:w16cid="http://schemas.microsoft.com/office/word/2016/wordml/cid" xmlns:w16="http://schemas.microsoft.com/office/word/2018/wordml" xmlns:w16du="http://schemas.microsoft.com/office/word/2023/wordml/word16du" xmlns:w16sdtdh="http://schemas.microsoft.com/office/word/2020/wordml/sdtdatahash" xmlns:w16sdtfl="http://schemas.microsoft.com/office/word/2024/wordml/sdtformatlock" xmlns:w16se="http://schemas.microsoft.com/office/word/2015/wordml/symex" mc:Ignorable="w14 w15 w16se w16cid w16 w16cex w16sdtdh w16sdtfl w16du">
-  <w:font w:name="Symbol">
-    <w:panose1 w:val="05050102010706020507"/>
+  <w:font w:name="Wingdings">
+    <w:panose1 w:val="05000000000000000000"/>
     <w:charset w:val="02"/>
-    <w:family w:val="roman"/>
+    <w:family w:val="auto"/>
     <w:pitch w:val="variable"/>
     <w:sig w:usb0="00000000" w:usb1="10000000" w:usb2="00000000" w:usb3="00000000" w:csb0="80000000" w:csb1="00000000"/>
   </w:font>
@@ -29511,10 +30287,10 @@
     <w:pitch w:val="fixed"/>
     <w:sig w:usb0="E0002EFF" w:usb1="C0007843" w:usb2="00000009" w:usb3="00000000" w:csb0="000001FF" w:csb1="00000000"/>
   </w:font>
-  <w:font w:name="Wingdings">
-    <w:panose1 w:val="05000000000000000000"/>
+  <w:font w:name="Symbol">
+    <w:panose1 w:val="05050102010706020507"/>
     <w:charset w:val="02"/>
-    <w:family w:val="auto"/>
+    <w:family w:val="roman"/>
     <w:pitch w:val="variable"/>
     <w:sig w:usb0="00000000" w:usb1="10000000" w:usb2="00000000" w:usb3="00000000" w:csb0="80000000" w:csb1="00000000"/>
   </w:font>
@@ -29577,6 +30353,8 @@
     <w:rsid w:val="00B35BB9"/>
     <w:rsid w:val="00C37AFC"/>
     <w:rsid w:val="00C45BCA"/>
+    <w:rsid w:val="00C872B2"/>
+    <w:rsid w:val="00CE013A"/>
     <w:rsid w:val="00DB7236"/>
     <w:rsid w:val="00DF6F35"/>
     <w:rsid w:val="00E11F0C"/>

</xml_diff>